<commit_message>
docs(orgcomp-series): register the IAM Governance Kit series home as Vol IX Book 06
Decides #1221's series-home question: Identity & Access Governance lands as
Vol IX Book 06 (book-day2-iam, slot IX-06), registered in the compliance
spine with its control contract (AC-2, AC-5, AC-6, IA-4, IA-5, AU-2 —
event-driven JML, certification campaigns, IAM evidence feed). The kit
realization stays gated on the requirements v0.9 -> v1.0 sign-off, stated in
the book and the spine comment. Volume IX overview, exec-summary designation
and link tables, crosswalk prose counts, sidebar, and derived files updated;
Book 00 deck/docx derivatives re-issued at the new Date Code. Book 06's own
DOCX/PPTX derivatives follow on the next authoring pass (no Quarto in this
environment).

Co-Authored-By: Claude Fable 5 <noreply@anthropic.com>
Claude-Session: https://claude.ai/code/session_01N5UTDTQvE1TzezbTuWtxxZ
</commit_message>
<xml_diff>
--- a/docs/customer-documents/orgcomp-series/Vol_IX_Book_00_OrgComp_Day2_Operations_Overview.docx
+++ b/docs/customer-documents/orgcomp-series/Vol_IX_Book_00_OrgComp_Day2_Operations_Overview.docx
@@ -31,7 +31,7 @@
         <w:pStyle w:val="Date"/>
       </w:pPr>
       <w:r>
-        <w:t xml:space="preserve">2026-07-12 15:00 ET</w:t>
+        <w:t>2026-07-19 12:10 ET</w:t>
       </w:r>
     </w:p>
     <w:p>
@@ -103,7 +103,7 @@
         <w:t xml:space="preserve"> </w:t>
       </w:r>
       <w:r>
-        <w:t xml:space="preserve">2026-07-12 15:00 ET</w:t>
+        <w:t>2026-07-19 12:10 ET</w:t>
       </w:r>
     </w:p>
     <w:bookmarkEnd w:id="9"/>
@@ -849,6 +849,56 @@
             </w:pPr>
             <w:r>
               <w:t xml:space="preserve">Lane F</w:t>
+            </w:r>
+          </w:p>
+        </w:tc>
+      </w:tr>
+      <w:tr>
+        <w:tc>
+          <w:tcPr/>
+          <w:p>
+            <w:pPr>
+              <w:pStyle w:val="Compact"/>
+            </w:pPr>
+            <w:r>
+              <w:rPr>
+                <w:b/>
+                <w:bCs/>
+              </w:rPr>
+              <w:t>Vol IX Book 06</w:t>
+            </w:r>
+          </w:p>
+        </w:tc>
+        <w:tc>
+          <w:tcPr/>
+          <w:p>
+            <w:pPr>
+              <w:pStyle w:val="Compact"/>
+            </w:pPr>
+            <w:r>
+              <w:t>Identity &amp; Access Governance</w:t>
+            </w:r>
+          </w:p>
+        </w:tc>
+        <w:tc>
+          <w:tcPr/>
+          <w:p>
+            <w:pPr>
+              <w:pStyle w:val="Compact"/>
+            </w:pPr>
+            <w:r>
+              <w:t>Event-driven JML from the HRIT SSOT, access-certification campaigns, and the IAM evidence feed (Kit Expansion Phase 2 — gated on requirements v1.0)</w:t>
+            </w:r>
+          </w:p>
+        </w:tc>
+        <w:tc>
+          <w:tcPr/>
+          <w:p>
+            <w:pPr>
+              <w:pStyle w:val="Compact"/>
+            </w:pPr>
+            <w:r>
+              <w:t>Phase 2 · #1221</w:t>
             </w:r>
           </w:p>
         </w:tc>

</xml_diff>

<commit_message>
docs(orgcomp-series): bring the Vol IX volume map up to Books 05-06
The volume-map figure stopped at Book 04 (it predated Books 05 and 06). The
bottom row now carries Teams Telephony, SaaS Integration Governance, and
Identity & Access Governance (Kit Phase 2, gated) plus a condensed
evidence-join panel; section header and fig-alt rewritten to match. Book 00
re-dated; pptx rebuilt from the deck spec and the docx patched in place
(date + embedded volume-map image swap).

Co-Authored-By: Claude Fable 5 <noreply@anthropic.com>
Claude-Session: https://claude.ai/code/session_01N5UTDTQvE1TzezbTuWtxxZ
</commit_message>
<xml_diff>
--- a/docs/customer-documents/orgcomp-series/Vol_IX_Book_00_OrgComp_Day2_Operations_Overview.docx
+++ b/docs/customer-documents/orgcomp-series/Vol_IX_Book_00_OrgComp_Day2_Operations_Overview.docx
@@ -31,7 +31,7 @@
         <w:pStyle w:val="Date"/>
       </w:pPr>
       <w:r>
-        <w:t>2026-07-19 16:20 ET</w:t>
+        <w:t>2026-07-19 17:05 ET</w:t>
       </w:r>
     </w:p>
     <w:p>
@@ -103,7 +103,7 @@
         <w:t xml:space="preserve"> </w:t>
       </w:r>
       <w:r>
-        <w:t>2026-07-19 16:20 ET</w:t>
+        <w:t>2026-07-19 17:05 ET</w:t>
       </w:r>
     </w:p>
     <w:bookmarkEnd w:id="9"/>

</xml_diff>